<commit_message>
Replace corpus DOCX with PDF conversions
</commit_message>
<xml_diff>
--- a/todo10_8/heading_corpus_95_word/05_bien_ban_hop/073_FORTIS_GC_Minutes_Mar_2026.docx
+++ b/todo10_8/heading_corpus_95_word/05_bien_ban_hop/073_FORTIS_GC_Minutes_Mar_2026.docx
@@ -3,159 +3,845 @@
 <w:document xmlns:wpc="http://schemas.microsoft.com/office/word/2010/wordprocessingCanvas" xmlns:mo="http://schemas.microsoft.com/office/mac/office/2008/main" xmlns:mc="http://schemas.openxmlformats.org/markup-compatibility/2006" xmlns:mv="urn:schemas-microsoft-com:mac:vml" xmlns:o="urn:schemas-microsoft-com:office:office" xmlns:r="http://schemas.openxmlformats.org/officeDocument/2006/relationships" xmlns:m="http://schemas.openxmlformats.org/officeDocument/2006/math" xmlns:v="urn:schemas-microsoft-com:vml" xmlns:wp14="http://schemas.microsoft.com/office/word/2010/wordprocessingDrawing" xmlns:wp="http://schemas.openxmlformats.org/drawingml/2006/wordprocessingDrawing" xmlns:w10="urn:schemas-microsoft-com:office:word" xmlns:w="http://schemas.openxmlformats.org/wordprocessingml/2006/main" xmlns:w14="http://schemas.microsoft.com/office/word/2010/wordml" xmlns:wpg="http://schemas.microsoft.com/office/word/2010/wordprocessingGroup" xmlns:wpi="http://schemas.microsoft.com/office/word/2010/wordprocessingInk" xmlns:wne="http://schemas.microsoft.com/office/word/2006/wordml" xmlns:wps="http://schemas.microsoft.com/office/word/2010/wordprocessingShape" mc:Ignorable="w14 wp14">
   <w:body>
     <w:p>
-      <w:r>
-        <w:rPr>
-          <w:rFonts w:ascii="Arial" w:hAnsi="Arial"/>
-          <w:b/>
-          <w:sz w:val="24"/>
-        </w:rPr>
-        <w:t>073_FORTIS_GC_Minutes_Mar_2026.pdf</w:t>
-      </w:r>
+      <w:pPr>
+        <w:autoSpaceDN w:val="0"/>
+        <w:autoSpaceDE w:val="0"/>
+        <w:widowControl/>
+        <w:spacing w:line="220" w:lineRule="exact" w:before="0" w:after="506"/>
+        <w:ind w:left="0" w:right="0"/>
+      </w:pPr>
     </w:p>
     <w:p>
-      <w:r>
-        <w:rPr>
-          <w:rFonts w:ascii="Arial" w:hAnsi="Arial"/>
-          <w:i/>
-          <w:sz w:val="16"/>
-        </w:rPr>
-        <w:t>Converted to DOCX from PDF text-layout extraction. Source path: 05_bien_ban_hop/073_FORTIS_GC_Minutes_Mar_2026.pdf</w:t>
-      </w:r>
-    </w:p>
-    <w:p/>
-    <w:p>
       <w:pPr>
-        <w:spacing w:after="0" w:line="240" w:lineRule="auto"/>
+        <w:autoSpaceDN w:val="0"/>
+        <w:autoSpaceDE w:val="0"/>
+        <w:widowControl/>
+        <w:spacing w:line="250" w:lineRule="auto" w:before="0" w:after="0"/>
+        <w:ind w:left="144" w:right="1584" w:firstLine="0"/>
+        <w:jc w:val="center"/>
       </w:pPr>
       <w:r>
         <w:rPr>
-          <w:rFonts w:ascii="Courier New" w:hAnsi="Courier New" w:eastAsia="Courier New"/>
-          <w:sz w:val="15"/>
+          <w:rFonts w:ascii="Times New Roman" w:hAnsi="Times New Roman" w:eastAsia="Times New Roman"/>
+          <w:b/>
+          <w:i w:val="0"/>
+          <w:color w:val="000000"/>
+          <w:sz w:val="24"/>
         </w:rPr>
-        <w:t xml:space="preserve">                     Minutes of March 10, 2026, Meeting of the</w:t>
+        <w:t xml:space="preserve">Minutes of March 10, 2026, Meeting of the </w:t>
+      </w:r>
+      <w:r>
         <w:br/>
-        <w:t xml:space="preserve">  Governing Committee (GC) of the Facilitation of Resources to Invest in Strengthening</w:t>
-        <w:br/>
-        <w:t xml:space="preserve">           Ukraine Financial Intermediary Fund (F.O.R.T.I.S. Ukraine FIF)</w:t>
-        <w:br/>
-        <w:br/>
-        <w:br/>
-        <w:t>Opening:</w:t>
-        <w:br/>
-        <w:t>The meeting was called to order at 7:00 am EST by Hideaki Imamura, Chair, with participants</w:t>
-        <w:br/>
-        <w:t>joining remotely.</w:t>
-        <w:br/>
-        <w:t>Present:</w:t>
-        <w:br/>
-        <w:t>Governing Committee: Marc Gurstein (Canada); Takuya Odawara (Japan); Olga Zykova</w:t>
-        <w:br/>
-        <w:t>(Ukraine); William Beach (United States).</w:t>
-        <w:br/>
-        <w:t>Observers: Robert Saum (IBRD);</w:t>
-        <w:br/>
-        <w:t>Secretariat: Sajjad Shah, Anthony Gaeta</w:t>
-        <w:br/>
-        <w:t>Trustee: Ashish Makkar</w:t>
-        <w:br/>
-        <w:t>World Bank Legal Department: Maria Lourdes Pardo.</w:t>
-        <w:br/>
-        <w:t>Additional participants: Simon O’Connor (Observer, Ukraine Donor Platform Secretariat);</w:t>
-        <w:br/>
-        <w:t>Natsumi Tajima, Kenta Hasegawa, Yuho Myoda (Japan) Natalie Hopkins (US)</w:t>
-        <w:br/>
-        <w:br/>
-        <w:br/>
-        <w:t>The F.O.R.T.I.S. Ukraine FIF Governing Committee discussed the following:</w:t>
-        <w:br/>
-        <w:t>Report on Currently Available Resources in the F.O.R.T.I.S. Ukraine FIF. The Trustee</w:t>
-        <w:br/>
-        <w:t>confirmed that as of February 28, 2026, $1,310.42 million is available for new commitments.</w:t>
-        <w:br/>
-        <w:t>Operating Context. The Governing Committee welcomed the overview from the Ukrainian GC</w:t>
-        <w:br/>
-        <w:t>Member on the importance of the F.O.R.T.I.S. FIF as a stable and predictable source of financing</w:t>
-        <w:br/>
-        <w:t>to help meet the needs for the 2026 budget, which assumes another full year of war; the</w:t>
-        <w:br/>
-        <w:t>Government’s priority to broaden the revenue base; its commitment to strengthen investment</w:t>
-        <w:br/>
-        <w:t>climate, public financial management; and public investment management. The GC member also</w:t>
-        <w:br/>
-        <w:t>welcomed the February 26 approval by the IMF of a new 48-month extended arrangement under</w:t>
-        <w:br/>
-        <w:t>the Extended Fund Facility (EFF) as part of a broader international financial package, including</w:t>
-        <w:br/>
-        <w:t>the macro-financial assistance from the European Union.</w:t>
-        <w:br/>
-        <w:t>Funding Request for Eighth Additional Financing to Public Expenditures for Administrative</w:t>
-        <w:br/>
-        <w:t>Capacity Endurance (PEACE) in Ukraine Investment Project Financing. The Governing</w:t>
-        <w:br/>
-        <w:t>Committee approved by consensus, with the affirmative votes by Canada and Japan, the use of</w:t>
-        <w:br/>
-        <w:t>$1.258 billion in F.O.R.T.I.S. Ukraine FIF resources to support the 8th additional financing to the</w:t>
-        <w:br/>
-        <w:t>PEACE project. Under this operation, FIF resources will be used to pay government and education</w:t>
-        <w:br/>
-        <w:t>sector wages; health care expenses included under the Program for Medical Guarantees; first</w:t>
-        <w:br/>
-        <w:t>responders’ wages; and social assistance benefits, and for the reimbursement of central government</w:t>
-        <w:br/>
-        <w:t>subsidies for monthly pensions payments. The United States recorded a non-blocking abstention</w:t>
-        <w:br/>
-        <w:br/>
-        <w:t xml:space="preserve">                                                1</w:t>
       </w:r>
-    </w:p>
-    <w:p>
       <w:r>
-        <w:br w:type="page"/>
+        <w:rPr>
+          <w:rFonts w:ascii="Times New Roman" w:hAnsi="Times New Roman" w:eastAsia="Times New Roman"/>
+          <w:b/>
+          <w:i w:val="0"/>
+          <w:color w:val="000000"/>
+          <w:sz w:val="24"/>
+        </w:rPr>
+        <w:t>Governing Committee (GC) of the</w:t>
+      </w:r>
+      <w:r>
+        <w:rPr>
+          <w:rFonts w:ascii="Times New Roman" w:hAnsi="Times New Roman" w:eastAsia="Times New Roman"/>
+          <w:b/>
+          <w:i w:val="0"/>
+          <w:color w:val="000000"/>
+          <w:sz w:val="24"/>
+        </w:rPr>
+        <w:t xml:space="preserve">Facilitation of Resources to Invest in Strengthening </w:t>
+      </w:r>
+      <w:r>
+        <w:rPr>
+          <w:rFonts w:ascii="Times New Roman" w:hAnsi="Times New Roman" w:eastAsia="Times New Roman"/>
+          <w:b/>
+          <w:i w:val="0"/>
+          <w:color w:val="000000"/>
+          <w:sz w:val="24"/>
+        </w:rPr>
+        <w:t xml:space="preserve">Ukraine Financial Intermediary Fund (F.O.R.T.I.S. Ukraine FIF) </w:t>
       </w:r>
     </w:p>
     <w:p>
       <w:pPr>
-        <w:spacing w:after="0" w:line="240" w:lineRule="auto"/>
+        <w:autoSpaceDN w:val="0"/>
+        <w:autoSpaceDE w:val="0"/>
+        <w:widowControl/>
+        <w:spacing w:line="250" w:lineRule="auto" w:before="490" w:after="0"/>
+        <w:ind w:left="0" w:right="1296" w:firstLine="0"/>
+        <w:jc w:val="left"/>
       </w:pPr>
       <w:r>
         <w:rPr>
-          <w:rFonts w:ascii="Courier New" w:hAnsi="Courier New" w:eastAsia="Courier New"/>
-          <w:sz w:val="15"/>
+          <w:rFonts w:ascii="Times New Roman" w:hAnsi="Times New Roman" w:eastAsia="Times New Roman"/>
+          <w:b/>
+          <w:i w:val="0"/>
+          <w:color w:val="000000"/>
+          <w:sz w:val="24"/>
         </w:rPr>
-        <w:t>on this Funding Request to avoid any perception that the U.S. contribution to the F.O.R.T.I.S.</w:t>
+        <w:t xml:space="preserve">Opening: </w:t>
+      </w:r>
+      <w:r>
         <w:br/>
-        <w:t>Ukraine FIF will support funding for pension payments, which is Congressionally prohibited.</w:t>
-        <w:br/>
-        <w:t>Next Bi-Annual Meeting of the GC. The Governing Committee agreed with the Chair’s proposal,</w:t>
-        <w:br/>
-        <w:t>consistent with the FIF Governance Framework, that no formal GC meeting will be scheduled for</w:t>
-        <w:br/>
-        <w:t>the remainder of 2026 given the resource availability after the funding decision above; and that a</w:t>
-        <w:br/>
-        <w:t>meeting could be convened at any time during the year in coordination with the Chair and members</w:t>
-        <w:br/>
-        <w:t>upon request of a GC member or for any developments that warrant such a meeting. Until such</w:t>
-        <w:br/>
-        <w:t>time, all other FIF business can be facilitated by the FIF Secretariat electronically.</w:t>
-        <w:br/>
-        <w:t>Next Steps. The Secretariat will issue Award Letters for the Approved PEACE Additional</w:t>
-        <w:br/>
-        <w:t>Financing Project.</w:t>
-        <w:br/>
-        <w:br/>
-        <w:br/>
-        <w:t xml:space="preserve">                                                2</w:t>
+      </w:r>
+      <w:r>
+        <w:rPr>
+          <w:rFonts w:ascii="Times New Roman" w:hAnsi="Times New Roman" w:eastAsia="Times New Roman"/>
+          <w:b w:val="0"/>
+          <w:i w:val="0"/>
+          <w:color w:val="000000"/>
+          <w:sz w:val="24"/>
+        </w:rPr>
+        <w:t xml:space="preserve">The meeting was called to order at 7:00 am EST by Hideaki Imamura, Chair, with participants </w:t>
+      </w:r>
+      <w:r>
+        <w:rPr>
+          <w:rFonts w:ascii="Times New Roman" w:hAnsi="Times New Roman" w:eastAsia="Times New Roman"/>
+          <w:b w:val="0"/>
+          <w:i w:val="0"/>
+          <w:color w:val="000000"/>
+          <w:sz w:val="24"/>
+        </w:rPr>
+        <w:t xml:space="preserve">joining remotely. </w:t>
       </w:r>
     </w:p>
     <w:p>
+      <w:pPr>
+        <w:autoSpaceDN w:val="0"/>
+        <w:autoSpaceDE w:val="0"/>
+        <w:widowControl/>
+        <w:spacing w:line="230" w:lineRule="auto" w:before="192" w:after="0"/>
+        <w:ind w:left="0" w:right="0" w:firstLine="0"/>
+        <w:jc w:val="left"/>
+      </w:pPr>
       <w:r>
-        <w:br w:type="page"/>
+        <w:rPr>
+          <w:rFonts w:ascii="Times New Roman" w:hAnsi="Times New Roman" w:eastAsia="Times New Roman"/>
+          <w:b/>
+          <w:i w:val="0"/>
+          <w:color w:val="000000"/>
+          <w:sz w:val="24"/>
+        </w:rPr>
+        <w:t xml:space="preserve">Present: </w:t>
       </w:r>
+    </w:p>
+    <w:p>
+      <w:pPr>
+        <w:autoSpaceDN w:val="0"/>
+        <w:autoSpaceDE w:val="0"/>
+        <w:widowControl/>
+        <w:spacing w:line="245" w:lineRule="auto" w:before="194" w:after="0"/>
+        <w:ind w:left="0" w:right="1296" w:firstLine="0"/>
+        <w:jc w:val="left"/>
+      </w:pPr>
+      <w:r>
+        <w:rPr>
+          <w:rFonts w:ascii="Times New Roman" w:hAnsi="Times New Roman" w:eastAsia="Times New Roman"/>
+          <w:b w:val="0"/>
+          <w:i w:val="0"/>
+          <w:color w:val="000000"/>
+          <w:sz w:val="24"/>
+        </w:rPr>
+        <w:t xml:space="preserve">Governing Committee: Marc Gurstein (Canada); Takuya Odawara (Japan); Olga Zykova </w:t>
+      </w:r>
+      <w:r>
+        <w:rPr>
+          <w:rFonts w:ascii="Times New Roman" w:hAnsi="Times New Roman" w:eastAsia="Times New Roman"/>
+          <w:b w:val="0"/>
+          <w:i w:val="0"/>
+          <w:color w:val="000000"/>
+          <w:sz w:val="24"/>
+        </w:rPr>
+        <w:t xml:space="preserve">(Ukraine); William Beach (United States). </w:t>
+      </w:r>
+    </w:p>
+    <w:p>
+      <w:pPr>
+        <w:autoSpaceDN w:val="0"/>
+        <w:autoSpaceDE w:val="0"/>
+        <w:widowControl/>
+        <w:spacing w:line="230" w:lineRule="auto" w:before="194" w:after="0"/>
+        <w:ind w:left="0" w:right="0" w:firstLine="0"/>
+        <w:jc w:val="left"/>
+      </w:pPr>
+      <w:r>
+        <w:rPr>
+          <w:rFonts w:ascii="Times New Roman" w:hAnsi="Times New Roman" w:eastAsia="Times New Roman"/>
+          <w:b w:val="0"/>
+          <w:i w:val="0"/>
+          <w:color w:val="000000"/>
+          <w:sz w:val="24"/>
+        </w:rPr>
+        <w:t xml:space="preserve">Observers: Robert Saum (IBRD); </w:t>
+      </w:r>
+    </w:p>
+    <w:p>
+      <w:pPr>
+        <w:autoSpaceDN w:val="0"/>
+        <w:autoSpaceDE w:val="0"/>
+        <w:widowControl/>
+        <w:spacing w:line="230" w:lineRule="auto" w:before="190" w:after="0"/>
+        <w:ind w:left="0" w:right="0" w:firstLine="0"/>
+        <w:jc w:val="left"/>
+      </w:pPr>
+      <w:r>
+        <w:rPr>
+          <w:rFonts w:ascii="Times New Roman" w:hAnsi="Times New Roman" w:eastAsia="Times New Roman"/>
+          <w:b w:val="0"/>
+          <w:i w:val="0"/>
+          <w:color w:val="000000"/>
+          <w:sz w:val="24"/>
+        </w:rPr>
+        <w:t xml:space="preserve">Secretariat: Sajjad Shah, Anthony Gaeta </w:t>
+      </w:r>
+    </w:p>
+    <w:p>
+      <w:pPr>
+        <w:autoSpaceDN w:val="0"/>
+        <w:autoSpaceDE w:val="0"/>
+        <w:widowControl/>
+        <w:spacing w:line="230" w:lineRule="auto" w:before="192" w:after="0"/>
+        <w:ind w:left="0" w:right="0" w:firstLine="0"/>
+        <w:jc w:val="left"/>
+      </w:pPr>
+      <w:r>
+        <w:rPr>
+          <w:rFonts w:ascii="Times New Roman" w:hAnsi="Times New Roman" w:eastAsia="Times New Roman"/>
+          <w:b w:val="0"/>
+          <w:i w:val="0"/>
+          <w:color w:val="000000"/>
+          <w:sz w:val="24"/>
+        </w:rPr>
+        <w:t xml:space="preserve">Trustee: Ashish Makkar </w:t>
+      </w:r>
+    </w:p>
+    <w:p>
+      <w:pPr>
+        <w:autoSpaceDN w:val="0"/>
+        <w:autoSpaceDE w:val="0"/>
+        <w:widowControl/>
+        <w:spacing w:line="230" w:lineRule="auto" w:before="192" w:after="0"/>
+        <w:ind w:left="0" w:right="0" w:firstLine="0"/>
+        <w:jc w:val="left"/>
+      </w:pPr>
+      <w:r>
+        <w:rPr>
+          <w:rFonts w:ascii="Times New Roman" w:hAnsi="Times New Roman" w:eastAsia="Times New Roman"/>
+          <w:b w:val="0"/>
+          <w:i w:val="0"/>
+          <w:color w:val="000000"/>
+          <w:sz w:val="24"/>
+        </w:rPr>
+        <w:t xml:space="preserve">World Bank Legal Department: Maria Lourdes Pardo. </w:t>
+      </w:r>
+    </w:p>
+    <w:p>
+      <w:pPr>
+        <w:autoSpaceDN w:val="0"/>
+        <w:autoSpaceDE w:val="0"/>
+        <w:widowControl/>
+        <w:spacing w:line="245" w:lineRule="auto" w:before="192" w:after="0"/>
+        <w:ind w:left="0" w:right="1296" w:firstLine="0"/>
+        <w:jc w:val="left"/>
+      </w:pPr>
+      <w:r>
+        <w:rPr>
+          <w:rFonts w:ascii="Times New Roman" w:hAnsi="Times New Roman" w:eastAsia="Times New Roman"/>
+          <w:b w:val="0"/>
+          <w:i w:val="0"/>
+          <w:color w:val="000000"/>
+          <w:sz w:val="24"/>
+        </w:rPr>
+        <w:t xml:space="preserve">Additional participants: Simon O’Connor (Observer, Ukraine Donor Platform Secretariat); </w:t>
+      </w:r>
+      <w:r>
+        <w:rPr>
+          <w:rFonts w:ascii="Times New Roman" w:hAnsi="Times New Roman" w:eastAsia="Times New Roman"/>
+          <w:b w:val="0"/>
+          <w:i w:val="0"/>
+          <w:color w:val="000000"/>
+          <w:sz w:val="24"/>
+        </w:rPr>
+        <w:t xml:space="preserve">Natsumi Tajima, Kenta Hasegawa, Yuho Myoda (Japan) Natalie Hopkins (US) </w:t>
+      </w:r>
+    </w:p>
+    <w:p>
+      <w:pPr>
+        <w:autoSpaceDN w:val="0"/>
+        <w:autoSpaceDE w:val="0"/>
+        <w:widowControl/>
+        <w:spacing w:line="230" w:lineRule="auto" w:before="650" w:after="0"/>
+        <w:ind w:left="0" w:right="0" w:firstLine="0"/>
+        <w:jc w:val="left"/>
+      </w:pPr>
+      <w:r>
+        <w:rPr>
+          <w:rFonts w:ascii="Times New Roman" w:hAnsi="Times New Roman" w:eastAsia="Times New Roman"/>
+          <w:b w:val="0"/>
+          <w:i w:val="0"/>
+          <w:color w:val="000000"/>
+          <w:sz w:val="24"/>
+        </w:rPr>
+        <w:t xml:space="preserve">The F.O.R.T.I.S. Ukraine FIF Governing Committee discussed the following: </w:t>
+      </w:r>
+    </w:p>
+    <w:p>
+      <w:pPr>
+        <w:autoSpaceDN w:val="0"/>
+        <w:autoSpaceDE w:val="0"/>
+        <w:widowControl/>
+        <w:spacing w:line="245" w:lineRule="auto" w:before="194" w:after="0"/>
+        <w:ind w:left="0" w:right="1296" w:firstLine="0"/>
+        <w:jc w:val="left"/>
+      </w:pPr>
+      <w:r>
+        <w:rPr>
+          <w:rFonts w:ascii="Times New Roman" w:hAnsi="Times New Roman" w:eastAsia="Times New Roman"/>
+          <w:b/>
+          <w:i w:val="0"/>
+          <w:color w:val="000000"/>
+          <w:sz w:val="24"/>
+        </w:rPr>
+        <w:t xml:space="preserve">Report on Currently Available Resources in the F.O.R.T.I.S. Ukraine FIF. </w:t>
+      </w:r>
+      <w:r>
+        <w:rPr>
+          <w:rFonts w:ascii="Times New Roman" w:hAnsi="Times New Roman" w:eastAsia="Times New Roman"/>
+          <w:b w:val="0"/>
+          <w:i w:val="0"/>
+          <w:color w:val="000000"/>
+          <w:sz w:val="24"/>
+        </w:rPr>
+        <w:t xml:space="preserve">The Trustee </w:t>
+      </w:r>
+      <w:r>
+        <w:rPr>
+          <w:rFonts w:ascii="Times New Roman" w:hAnsi="Times New Roman" w:eastAsia="Times New Roman"/>
+          <w:b w:val="0"/>
+          <w:i w:val="0"/>
+          <w:color w:val="000000"/>
+          <w:sz w:val="24"/>
+        </w:rPr>
+        <w:t xml:space="preserve">confirmed that as of February 28, 2026, $1,310.42 million is available for new commitments. </w:t>
+      </w:r>
+    </w:p>
+    <w:p>
+      <w:pPr>
+        <w:autoSpaceDN w:val="0"/>
+        <w:autoSpaceDE w:val="0"/>
+        <w:widowControl/>
+        <w:spacing w:line="257" w:lineRule="auto" w:before="194" w:after="0"/>
+        <w:ind w:left="0" w:right="1378" w:firstLine="0"/>
+        <w:jc w:val="both"/>
+      </w:pPr>
+      <w:r>
+        <w:rPr>
+          <w:rFonts w:ascii="Times New Roman" w:hAnsi="Times New Roman" w:eastAsia="Times New Roman"/>
+          <w:b/>
+          <w:i w:val="0"/>
+          <w:color w:val="000000"/>
+          <w:sz w:val="24"/>
+        </w:rPr>
+        <w:t>Operating Context</w:t>
+      </w:r>
+      <w:r>
+        <w:rPr>
+          <w:rFonts w:ascii="Times New Roman" w:hAnsi="Times New Roman" w:eastAsia="Times New Roman"/>
+          <w:b w:val="0"/>
+          <w:i w:val="0"/>
+          <w:color w:val="000000"/>
+          <w:sz w:val="24"/>
+        </w:rPr>
+        <w:t xml:space="preserve">. The Governing Committee welcomed the overview from the Ukrainian GC </w:t>
+      </w:r>
+      <w:r>
+        <w:rPr>
+          <w:rFonts w:ascii="Times New Roman" w:hAnsi="Times New Roman" w:eastAsia="Times New Roman"/>
+          <w:b w:val="0"/>
+          <w:i w:val="0"/>
+          <w:color w:val="000000"/>
+          <w:sz w:val="24"/>
+        </w:rPr>
+        <w:t xml:space="preserve">Member on the importance of the F.O.R.T.I.S. FIF as a stable and predictable source of financing </w:t>
+      </w:r>
+      <w:r>
+        <w:rPr>
+          <w:rFonts w:ascii="Times New Roman" w:hAnsi="Times New Roman" w:eastAsia="Times New Roman"/>
+          <w:b w:val="0"/>
+          <w:i w:val="0"/>
+          <w:color w:val="000000"/>
+          <w:sz w:val="24"/>
+        </w:rPr>
+        <w:t xml:space="preserve">to help meet the needs for the 2026 budget, which assumes another full year of war; the </w:t>
+      </w:r>
+      <w:r>
+        <w:rPr>
+          <w:rFonts w:ascii="Times New Roman" w:hAnsi="Times New Roman" w:eastAsia="Times New Roman"/>
+          <w:b w:val="0"/>
+          <w:i w:val="0"/>
+          <w:color w:val="000000"/>
+          <w:sz w:val="24"/>
+        </w:rPr>
+        <w:t xml:space="preserve">Government’s priority to broaden the revenue base; its commitment to strengthen investment </w:t>
+      </w:r>
+      <w:r>
+        <w:rPr>
+          <w:rFonts w:ascii="Times New Roman" w:hAnsi="Times New Roman" w:eastAsia="Times New Roman"/>
+          <w:b w:val="0"/>
+          <w:i w:val="0"/>
+          <w:color w:val="000000"/>
+          <w:sz w:val="24"/>
+        </w:rPr>
+        <w:t xml:space="preserve">climate, public financial management; and public investment management. The GC member also </w:t>
+      </w:r>
+      <w:r>
+        <w:rPr>
+          <w:rFonts w:ascii="Times New Roman" w:hAnsi="Times New Roman" w:eastAsia="Times New Roman"/>
+          <w:b w:val="0"/>
+          <w:i w:val="0"/>
+          <w:color w:val="000000"/>
+          <w:sz w:val="24"/>
+        </w:rPr>
+        <w:t xml:space="preserve">welcomed the February 26 approval by the IMF of a new 48-month extended arrangement under </w:t>
+      </w:r>
+      <w:r>
+        <w:rPr>
+          <w:rFonts w:ascii="Times New Roman" w:hAnsi="Times New Roman" w:eastAsia="Times New Roman"/>
+          <w:b w:val="0"/>
+          <w:i w:val="0"/>
+          <w:color w:val="000000"/>
+          <w:sz w:val="24"/>
+        </w:rPr>
+        <w:t xml:space="preserve">the Extended Fund Facility (EFF) as part of a broader international financial package, including </w:t>
+      </w:r>
+      <w:r>
+        <w:rPr>
+          <w:rFonts w:ascii="Times New Roman" w:hAnsi="Times New Roman" w:eastAsia="Times New Roman"/>
+          <w:b w:val="0"/>
+          <w:i w:val="0"/>
+          <w:color w:val="000000"/>
+          <w:sz w:val="24"/>
+        </w:rPr>
+        <w:t xml:space="preserve">the macro-financial assistance from the European Union. </w:t>
+      </w:r>
+    </w:p>
+    <w:p>
+      <w:pPr>
+        <w:autoSpaceDN w:val="0"/>
+        <w:autoSpaceDE w:val="0"/>
+        <w:widowControl/>
+        <w:spacing w:line="257" w:lineRule="auto" w:before="190" w:after="0"/>
+        <w:ind w:left="0" w:right="1378" w:firstLine="0"/>
+        <w:jc w:val="both"/>
+      </w:pPr>
+      <w:r>
+        <w:rPr>
+          <w:rFonts w:ascii="Times New Roman" w:hAnsi="Times New Roman" w:eastAsia="Times New Roman"/>
+          <w:b/>
+          <w:i w:val="0"/>
+          <w:color w:val="000000"/>
+          <w:sz w:val="24"/>
+        </w:rPr>
+        <w:t xml:space="preserve">Funding Request for Eighth Additional Financing to Public Expenditures for Administrative </w:t>
+      </w:r>
+      <w:r>
+        <w:rPr>
+          <w:rFonts w:ascii="Times New Roman" w:hAnsi="Times New Roman" w:eastAsia="Times New Roman"/>
+          <w:b/>
+          <w:i w:val="0"/>
+          <w:color w:val="000000"/>
+          <w:sz w:val="24"/>
+        </w:rPr>
+        <w:t xml:space="preserve">Capacity Endurance (PEACE) in Ukraine Investment Project Financing. The Governing </w:t>
+      </w:r>
+      <w:r>
+        <w:rPr>
+          <w:rFonts w:ascii="Times New Roman" w:hAnsi="Times New Roman" w:eastAsia="Times New Roman"/>
+          <w:b/>
+          <w:i w:val="0"/>
+          <w:color w:val="000000"/>
+          <w:sz w:val="24"/>
+        </w:rPr>
+        <w:t xml:space="preserve">Committee approved by consensus, with the affirmative votes by </w:t>
+      </w:r>
+      <w:r>
+        <w:rPr>
+          <w:rFonts w:ascii="Times New Roman" w:hAnsi="Times New Roman" w:eastAsia="Times New Roman"/>
+          <w:b w:val="0"/>
+          <w:i w:val="0"/>
+          <w:color w:val="000000"/>
+          <w:sz w:val="24"/>
+        </w:rPr>
+        <w:t xml:space="preserve">Canada and Japan, the use of </w:t>
+      </w:r>
+      <w:r>
+        <w:rPr>
+          <w:rFonts w:ascii="Times New Roman" w:hAnsi="Times New Roman" w:eastAsia="Times New Roman"/>
+          <w:b w:val="0"/>
+          <w:i w:val="0"/>
+          <w:color w:val="000000"/>
+          <w:sz w:val="24"/>
+        </w:rPr>
+        <w:t>$1.258 billion in F.O.R.T.I.S. Ukraine FIF resources to support the 8</w:t>
+      </w:r>
+      <w:r>
+        <w:rPr>
+          <w:rFonts w:ascii="Times New Roman" w:hAnsi="Times New Roman" w:eastAsia="Times New Roman"/>
+          <w:b w:val="0"/>
+          <w:i w:val="0"/>
+          <w:color w:val="000000"/>
+          <w:sz w:val="16"/>
+        </w:rPr>
+        <w:t>th</w:t>
+      </w:r>
+      <w:r>
+        <w:rPr>
+          <w:rFonts w:ascii="Times New Roman" w:hAnsi="Times New Roman" w:eastAsia="Times New Roman"/>
+          <w:b w:val="0"/>
+          <w:i w:val="0"/>
+          <w:color w:val="000000"/>
+          <w:sz w:val="24"/>
+        </w:rPr>
+        <w:t xml:space="preserve"> additional financing to the </w:t>
+      </w:r>
+      <w:r>
+        <w:rPr>
+          <w:rFonts w:ascii="Times New Roman" w:hAnsi="Times New Roman" w:eastAsia="Times New Roman"/>
+          <w:b w:val="0"/>
+          <w:i w:val="0"/>
+          <w:color w:val="000000"/>
+          <w:sz w:val="24"/>
+        </w:rPr>
+        <w:t xml:space="preserve">PEACE project.  Under this operation, FIF resources will be used to pay government and education </w:t>
+      </w:r>
+      <w:r>
+        <w:rPr>
+          <w:rFonts w:ascii="Times New Roman" w:hAnsi="Times New Roman" w:eastAsia="Times New Roman"/>
+          <w:b w:val="0"/>
+          <w:i w:val="0"/>
+          <w:color w:val="000000"/>
+          <w:sz w:val="24"/>
+        </w:rPr>
+        <w:t xml:space="preserve">sector wages; health care expenses included under the Program for Medical Guarantees; first </w:t>
+      </w:r>
+      <w:r>
+        <w:rPr>
+          <w:rFonts w:ascii="Times New Roman" w:hAnsi="Times New Roman" w:eastAsia="Times New Roman"/>
+          <w:b w:val="0"/>
+          <w:i w:val="0"/>
+          <w:color w:val="000000"/>
+          <w:sz w:val="24"/>
+        </w:rPr>
+        <w:t xml:space="preserve">responders’ wages; and social assistance benefits, and for the reimbursement of central government </w:t>
+      </w:r>
+      <w:r>
+        <w:rPr>
+          <w:rFonts w:ascii="Times New Roman" w:hAnsi="Times New Roman" w:eastAsia="Times New Roman"/>
+          <w:b w:val="0"/>
+          <w:i w:val="0"/>
+          <w:color w:val="000000"/>
+          <w:sz w:val="24"/>
+        </w:rPr>
+        <w:t xml:space="preserve">subsidies for monthly pensions payments. The United States recorded a non-blocking abstention </w:t>
+      </w:r>
+    </w:p>
+    <w:p>
+      <w:pPr>
+        <w:autoSpaceDN w:val="0"/>
+        <w:autoSpaceDE w:val="0"/>
+        <w:widowControl/>
+        <w:spacing w:line="230" w:lineRule="auto" w:before="364" w:after="422"/>
+        <w:ind w:left="0" w:right="6000" w:firstLine="0"/>
+        <w:jc w:val="right"/>
+      </w:pPr>
+      <w:r>
+        <w:rPr>
+          <w:rFonts w:ascii="Times New Roman" w:hAnsi="Times New Roman" w:eastAsia="Times New Roman"/>
+          <w:b w:val="0"/>
+          <w:i w:val="0"/>
+          <w:color w:val="000000"/>
+          <w:sz w:val="24"/>
+        </w:rPr>
+        <w:t xml:space="preserve">1 </w:t>
+      </w:r>
+    </w:p>
+    <w:tbl>
+      <w:tblPr>
+        <w:tblW w:type="auto" w:w="0"/>
+        <w:tblLayout w:type="fixed"/>
+        <w:tblLook w:firstColumn="1" w:firstRow="1" w:lastColumn="0" w:lastRow="0" w:noHBand="0" w:noVBand="1" w:val="04A0"/>
+        <w:tblInd w:w="8958.0" w:type="dxa"/>
+      </w:tblPr>
+      <w:tblGrid>
+        <w:gridCol w:w="9360"/>
+      </w:tblGrid>
+      <w:tr>
+        <w:trPr>
+          <w:trHeight w:hRule="exact" w:val="544"/>
+        </w:trPr>
+        <w:tc>
+          <w:tcPr>
+            <w:tcW w:type="dxa" w:w="1842"/>
+            <w:tcBorders>
+              <w:start w:sz="2.240000009536743" w:val="single" w:color="#000000"/>
+              <w:top w:sz="2.240000009536743" w:val="single" w:color="#000000"/>
+              <w:end w:sz="2.240000009536743" w:val="single" w:color="#000000"/>
+              <w:bottom w:sz="2.240000009536743" w:val="single" w:color="#000000"/>
+            </w:tcBorders>
+            <w:tcMar>
+              <w:start w:w="0" w:type="dxa"/>
+              <w:end w:w="0" w:type="dxa"/>
+            </w:tcMar>
+          </w:tcPr>
+          <w:p/>
+        </w:tc>
+      </w:tr>
+    </w:tbl>
+    <w:p>
+      <w:pPr>
+        <w:autoSpaceDN w:val="0"/>
+        <w:autoSpaceDE w:val="0"/>
+        <w:widowControl/>
+        <w:spacing w:line="14" w:lineRule="exact" w:before="0" w:after="0"/>
+        <w:ind w:left="0" w:right="0"/>
+      </w:pPr>
+    </w:p>
+    <w:p>
+      <w:pPr>
+        <w:sectPr>
+          <w:pgSz w:w="12240" w:h="15840"/>
+          <w:pgMar w:top="724" w:right="0" w:bottom="0" w:left="1440" w:header="720" w:footer="720" w:gutter="0"/>
+          <w:cols/>
+          <w:docGrid w:linePitch="360"/>
+        </w:sectPr>
+      </w:pPr>
+    </w:p>
+    <w:p>
+      <w:pPr>
+        <w:autoSpaceDN w:val="0"/>
+        <w:autoSpaceDE w:val="0"/>
+        <w:widowControl/>
+        <w:spacing w:line="220" w:lineRule="exact" w:before="0" w:after="506"/>
+        <w:ind w:left="0" w:right="0"/>
+      </w:pPr>
+    </w:p>
+    <w:p>
+      <w:pPr>
+        <w:autoSpaceDN w:val="0"/>
+        <w:autoSpaceDE w:val="0"/>
+        <w:widowControl/>
+        <w:spacing w:line="245" w:lineRule="auto" w:before="0" w:after="0"/>
+        <w:ind w:left="0" w:right="1296" w:firstLine="0"/>
+        <w:jc w:val="left"/>
+      </w:pPr>
+      <w:r>
+        <w:rPr>
+          <w:rFonts w:ascii="Times New Roman" w:hAnsi="Times New Roman" w:eastAsia="Times New Roman"/>
+          <w:b w:val="0"/>
+          <w:i w:val="0"/>
+          <w:color w:val="000000"/>
+          <w:sz w:val="24"/>
+        </w:rPr>
+        <w:t xml:space="preserve">on this Funding Request to avoid any perception that the U.S. contribution to the F.O.R.T.I.S. </w:t>
+      </w:r>
+      <w:r>
+        <w:rPr>
+          <w:rFonts w:ascii="Times New Roman" w:hAnsi="Times New Roman" w:eastAsia="Times New Roman"/>
+          <w:b w:val="0"/>
+          <w:i w:val="0"/>
+          <w:color w:val="000000"/>
+          <w:sz w:val="24"/>
+        </w:rPr>
+        <w:t xml:space="preserve">Ukraine FIF will support funding for pension payments, which is Congressionally prohibited. </w:t>
+      </w:r>
+    </w:p>
+    <w:p>
+      <w:pPr>
+        <w:autoSpaceDN w:val="0"/>
+        <w:autoSpaceDE w:val="0"/>
+        <w:widowControl/>
+        <w:spacing w:line="254" w:lineRule="auto" w:before="192" w:after="0"/>
+        <w:ind w:left="0" w:right="1378" w:firstLine="0"/>
+        <w:jc w:val="both"/>
+      </w:pPr>
+      <w:r>
+        <w:rPr>
+          <w:rFonts w:ascii="Times New Roman" w:hAnsi="Times New Roman" w:eastAsia="Times New Roman"/>
+          <w:b/>
+          <w:i w:val="0"/>
+          <w:color w:val="000000"/>
+          <w:sz w:val="24"/>
+        </w:rPr>
+        <w:t xml:space="preserve">Next Bi-Annual Meeting of the GC. </w:t>
+      </w:r>
+      <w:r>
+        <w:rPr>
+          <w:rFonts w:ascii="Times New Roman" w:hAnsi="Times New Roman" w:eastAsia="Times New Roman"/>
+          <w:b w:val="0"/>
+          <w:i w:val="0"/>
+          <w:color w:val="000000"/>
+          <w:sz w:val="24"/>
+        </w:rPr>
+        <w:t xml:space="preserve">The Governing Committee agreed with the Chair’s proposal, </w:t>
+      </w:r>
+      <w:r>
+        <w:rPr>
+          <w:rFonts w:ascii="Times New Roman" w:hAnsi="Times New Roman" w:eastAsia="Times New Roman"/>
+          <w:b w:val="0"/>
+          <w:i w:val="0"/>
+          <w:color w:val="000000"/>
+          <w:sz w:val="24"/>
+        </w:rPr>
+        <w:t xml:space="preserve">consistent with the FIF Governance Framework, that no formal GC meeting will be scheduled for </w:t>
+      </w:r>
+      <w:r>
+        <w:rPr>
+          <w:rFonts w:ascii="Times New Roman" w:hAnsi="Times New Roman" w:eastAsia="Times New Roman"/>
+          <w:b w:val="0"/>
+          <w:i w:val="0"/>
+          <w:color w:val="000000"/>
+          <w:sz w:val="24"/>
+        </w:rPr>
+        <w:t xml:space="preserve">the remainder of 2026 given the resource availability after the funding decision above; and that a </w:t>
+      </w:r>
+      <w:r>
+        <w:rPr>
+          <w:rFonts w:ascii="Times New Roman" w:hAnsi="Times New Roman" w:eastAsia="Times New Roman"/>
+          <w:b w:val="0"/>
+          <w:i w:val="0"/>
+          <w:color w:val="000000"/>
+          <w:sz w:val="24"/>
+        </w:rPr>
+        <w:t xml:space="preserve">meeting could be convened at any time during the year in coordination with the Chair and members </w:t>
+      </w:r>
+      <w:r>
+        <w:rPr>
+          <w:rFonts w:ascii="Times New Roman" w:hAnsi="Times New Roman" w:eastAsia="Times New Roman"/>
+          <w:b w:val="0"/>
+          <w:i w:val="0"/>
+          <w:color w:val="000000"/>
+          <w:sz w:val="24"/>
+        </w:rPr>
+        <w:t xml:space="preserve">upon request of a GC member or for any developments that warrant such a meeting. Until such </w:t>
+      </w:r>
+      <w:r>
+        <w:rPr>
+          <w:rFonts w:ascii="Times New Roman" w:hAnsi="Times New Roman" w:eastAsia="Times New Roman"/>
+          <w:b w:val="0"/>
+          <w:i w:val="0"/>
+          <w:color w:val="000000"/>
+          <w:sz w:val="24"/>
+        </w:rPr>
+        <w:t xml:space="preserve">time, all other FIF business can be facilitated by the FIF Secretariat electronically. </w:t>
+      </w:r>
+    </w:p>
+    <w:p>
+      <w:pPr>
+        <w:autoSpaceDN w:val="0"/>
+        <w:autoSpaceDE w:val="0"/>
+        <w:widowControl/>
+        <w:spacing w:line="245" w:lineRule="auto" w:before="192" w:after="0"/>
+        <w:ind w:left="0" w:right="1296" w:firstLine="0"/>
+        <w:jc w:val="left"/>
+      </w:pPr>
+      <w:r>
+        <w:rPr>
+          <w:rFonts w:ascii="Times New Roman" w:hAnsi="Times New Roman" w:eastAsia="Times New Roman"/>
+          <w:b/>
+          <w:i w:val="0"/>
+          <w:color w:val="000000"/>
+          <w:sz w:val="24"/>
+        </w:rPr>
+        <w:t xml:space="preserve">Next Steps. </w:t>
+      </w:r>
+      <w:r>
+        <w:rPr>
+          <w:rFonts w:ascii="Times New Roman" w:hAnsi="Times New Roman" w:eastAsia="Times New Roman"/>
+          <w:b w:val="0"/>
+          <w:i w:val="0"/>
+          <w:color w:val="000000"/>
+          <w:sz w:val="24"/>
+        </w:rPr>
+        <w:t xml:space="preserve">The Secretariat will issue Award Letters for the Approved PEACE Additional </w:t>
+      </w:r>
+      <w:r>
+        <w:rPr>
+          <w:rFonts w:ascii="Times New Roman" w:hAnsi="Times New Roman" w:eastAsia="Times New Roman"/>
+          <w:b w:val="0"/>
+          <w:i w:val="0"/>
+          <w:color w:val="000000"/>
+          <w:sz w:val="24"/>
+        </w:rPr>
+        <w:t>Financing Project.</w:t>
+      </w:r>
+    </w:p>
+    <w:p>
+      <w:pPr>
+        <w:autoSpaceDN w:val="0"/>
+        <w:autoSpaceDE w:val="0"/>
+        <w:widowControl/>
+        <w:spacing w:line="230" w:lineRule="auto" w:before="9870" w:after="422"/>
+        <w:ind w:left="0" w:right="6000" w:firstLine="0"/>
+        <w:jc w:val="right"/>
+      </w:pPr>
+      <w:r>
+        <w:rPr>
+          <w:rFonts w:ascii="Times New Roman" w:hAnsi="Times New Roman" w:eastAsia="Times New Roman"/>
+          <w:b w:val="0"/>
+          <w:i w:val="0"/>
+          <w:color w:val="000000"/>
+          <w:sz w:val="24"/>
+        </w:rPr>
+        <w:t xml:space="preserve">2 </w:t>
+      </w:r>
+    </w:p>
+    <w:tbl>
+      <w:tblPr>
+        <w:tblW w:type="auto" w:w="0"/>
+        <w:tblLayout w:type="fixed"/>
+        <w:tblLook w:firstColumn="1" w:firstRow="1" w:lastColumn="0" w:lastRow="0" w:noHBand="0" w:noVBand="1" w:val="04A0"/>
+        <w:tblInd w:w="8958.0" w:type="dxa"/>
+      </w:tblPr>
+      <w:tblGrid>
+        <w:gridCol w:w="9360"/>
+      </w:tblGrid>
+      <w:tr>
+        <w:trPr>
+          <w:trHeight w:hRule="exact" w:val="544"/>
+        </w:trPr>
+        <w:tc>
+          <w:tcPr>
+            <w:tcW w:type="dxa" w:w="1842"/>
+            <w:tcBorders>
+              <w:start w:sz="2.240000009536743" w:val="single" w:color="#000000"/>
+              <w:top w:sz="2.240000009536743" w:val="single" w:color="#000000"/>
+              <w:end w:sz="2.240000009536743" w:val="single" w:color="#000000"/>
+              <w:bottom w:sz="2.240000009536743" w:val="single" w:color="#000000"/>
+            </w:tcBorders>
+            <w:tcMar>
+              <w:start w:w="0" w:type="dxa"/>
+              <w:end w:w="0" w:type="dxa"/>
+            </w:tcMar>
+          </w:tcPr>
+          <w:p/>
+        </w:tc>
+      </w:tr>
+    </w:tbl>
+    <w:p>
+      <w:pPr>
+        <w:autoSpaceDN w:val="0"/>
+        <w:autoSpaceDE w:val="0"/>
+        <w:widowControl/>
+        <w:spacing w:line="14" w:lineRule="exact" w:before="0" w:after="0"/>
+        <w:ind w:left="0" w:right="0"/>
+      </w:pPr>
     </w:p>
     <w:sectPr>
       <w:pgSz w:w="12240" w:h="15840"/>
-      <w:pgMar w:top="720" w:right="720" w:bottom="720" w:left="720" w:header="720" w:footer="720" w:gutter="0"/>
-      <w:cols w:space="720"/>
+      <w:pgMar w:top="724" w:right="0" w:bottom="0" w:left="1440" w:header="720" w:footer="720" w:gutter="0"/>
+      <w:cols/>
       <w:docGrid w:linePitch="360"/>
     </w:sectPr>
   </w:body>

</xml_diff>